<commit_message>
EN submission: fixed column widths
Co-Authored-By: Claude Fable 5.1 <noreply@anthropic.com>
</commit_message>
<xml_diff>
--- a/hemonc_feature_submission_EN_20261021.docx
+++ b/hemonc_feature_submission_EN_20261021.docx
@@ -57,15 +57,15 @@
         </w:tblCellMar>
       </w:tblPr>
       <w:tblGrid>
-        <w:gridCol w:w="3400"/>
-        <w:gridCol w:w="4648"/>
-        <w:gridCol w:w="3290"/>
+        <w:gridCol w:w="3463"/>
+        <w:gridCol w:w="4560"/>
+        <w:gridCol w:w="3315"/>
       </w:tblGrid>
       <w:tr>
         <w:trPr/>
         <w:tc>
           <w:tcPr>
-            <w:tcW w:w="3400" w:type="dxa"/>
+            <w:tcW w:w="3463" w:type="dxa"/>
             <w:tcBorders>
               <w:top w:val="single" w:sz="6" w:space="0" w:color="808080"/>
               <w:left w:val="single" w:sz="6" w:space="0" w:color="808080"/>
@@ -92,7 +92,7 @@
         </w:tc>
         <w:tc>
           <w:tcPr>
-            <w:tcW w:w="4648" w:type="dxa"/>
+            <w:tcW w:w="4560" w:type="dxa"/>
             <w:tcBorders>
               <w:top w:val="single" w:sz="6" w:space="0" w:color="808080"/>
               <w:left w:val="single" w:sz="2" w:space="0" w:color="808080"/>
@@ -119,7 +119,7 @@
         </w:tc>
         <w:tc>
           <w:tcPr>
-            <w:tcW w:w="3290" w:type="dxa"/>
+            <w:tcW w:w="3315" w:type="dxa"/>
             <w:tcBorders>
               <w:top w:val="single" w:sz="6" w:space="0" w:color="808080"/>
               <w:left w:val="single" w:sz="2" w:space="0" w:color="808080"/>
@@ -149,7 +149,7 @@
         <w:trPr/>
         <w:tc>
           <w:tcPr>
-            <w:tcW w:w="3400" w:type="dxa"/>
+            <w:tcW w:w="3463" w:type="dxa"/>
             <w:tcBorders>
               <w:left w:val="single" w:sz="6" w:space="0" w:color="808080"/>
               <w:bottom w:val="single" w:sz="2" w:space="0" w:color="808080"/>
@@ -173,7 +173,7 @@
         </w:tc>
         <w:tc>
           <w:tcPr>
-            <w:tcW w:w="4648" w:type="dxa"/>
+            <w:tcW w:w="4560" w:type="dxa"/>
             <w:tcBorders>
               <w:left w:val="single" w:sz="2" w:space="0" w:color="808080"/>
               <w:bottom w:val="single" w:sz="2" w:space="0" w:color="808080"/>
@@ -197,7 +197,7 @@
         </w:tc>
         <w:tc>
           <w:tcPr>
-            <w:tcW w:w="3290" w:type="dxa"/>
+            <w:tcW w:w="3315" w:type="dxa"/>
             <w:tcBorders>
               <w:left w:val="single" w:sz="2" w:space="0" w:color="808080"/>
               <w:bottom w:val="single" w:sz="2" w:space="0" w:color="808080"/>
@@ -228,7 +228,7 @@
         <w:trPr/>
         <w:tc>
           <w:tcPr>
-            <w:tcW w:w="3400" w:type="dxa"/>
+            <w:tcW w:w="3463" w:type="dxa"/>
             <w:tcBorders>
               <w:left w:val="single" w:sz="6" w:space="0" w:color="808080"/>
               <w:bottom w:val="single" w:sz="2" w:space="0" w:color="808080"/>
@@ -252,7 +252,7 @@
         </w:tc>
         <w:tc>
           <w:tcPr>
-            <w:tcW w:w="4648" w:type="dxa"/>
+            <w:tcW w:w="4560" w:type="dxa"/>
             <w:tcBorders>
               <w:left w:val="single" w:sz="2" w:space="0" w:color="808080"/>
               <w:bottom w:val="single" w:sz="2" w:space="0" w:color="808080"/>
@@ -276,7 +276,7 @@
         </w:tc>
         <w:tc>
           <w:tcPr>
-            <w:tcW w:w="3290" w:type="dxa"/>
+            <w:tcW w:w="3315" w:type="dxa"/>
             <w:tcBorders>
               <w:left w:val="single" w:sz="2" w:space="0" w:color="808080"/>
               <w:bottom w:val="single" w:sz="2" w:space="0" w:color="808080"/>
@@ -308,7 +308,7 @@
         <w:trPr/>
         <w:tc>
           <w:tcPr>
-            <w:tcW w:w="3400" w:type="dxa"/>
+            <w:tcW w:w="3463" w:type="dxa"/>
             <w:tcBorders>
               <w:left w:val="single" w:sz="6" w:space="0" w:color="808080"/>
               <w:bottom w:val="single" w:sz="2" w:space="0" w:color="808080"/>
@@ -332,7 +332,7 @@
         </w:tc>
         <w:tc>
           <w:tcPr>
-            <w:tcW w:w="4648" w:type="dxa"/>
+            <w:tcW w:w="4560" w:type="dxa"/>
             <w:tcBorders>
               <w:left w:val="single" w:sz="2" w:space="0" w:color="808080"/>
               <w:bottom w:val="single" w:sz="2" w:space="0" w:color="808080"/>
@@ -356,7 +356,7 @@
         </w:tc>
         <w:tc>
           <w:tcPr>
-            <w:tcW w:w="3290" w:type="dxa"/>
+            <w:tcW w:w="3315" w:type="dxa"/>
             <w:tcBorders>
               <w:left w:val="single" w:sz="2" w:space="0" w:color="808080"/>
               <w:bottom w:val="single" w:sz="2" w:space="0" w:color="808080"/>
@@ -388,7 +388,7 @@
         <w:trPr/>
         <w:tc>
           <w:tcPr>
-            <w:tcW w:w="3400" w:type="dxa"/>
+            <w:tcW w:w="3463" w:type="dxa"/>
             <w:tcBorders>
               <w:left w:val="single" w:sz="6" w:space="0" w:color="808080"/>
               <w:bottom w:val="single" w:sz="2" w:space="0" w:color="808080"/>
@@ -412,7 +412,7 @@
         </w:tc>
         <w:tc>
           <w:tcPr>
-            <w:tcW w:w="4648" w:type="dxa"/>
+            <w:tcW w:w="4560" w:type="dxa"/>
             <w:tcBorders>
               <w:left w:val="single" w:sz="2" w:space="0" w:color="808080"/>
               <w:bottom w:val="single" w:sz="2" w:space="0" w:color="808080"/>
@@ -444,7 +444,7 @@
         </w:tc>
         <w:tc>
           <w:tcPr>
-            <w:tcW w:w="3290" w:type="dxa"/>
+            <w:tcW w:w="3315" w:type="dxa"/>
             <w:tcBorders>
               <w:left w:val="single" w:sz="2" w:space="0" w:color="808080"/>
               <w:bottom w:val="single" w:sz="2" w:space="0" w:color="808080"/>
@@ -471,7 +471,7 @@
         <w:trPr/>
         <w:tc>
           <w:tcPr>
-            <w:tcW w:w="3400" w:type="dxa"/>
+            <w:tcW w:w="3463" w:type="dxa"/>
             <w:tcBorders>
               <w:left w:val="single" w:sz="6" w:space="0" w:color="808080"/>
               <w:bottom w:val="single" w:sz="2" w:space="0" w:color="808080"/>
@@ -495,7 +495,7 @@
         </w:tc>
         <w:tc>
           <w:tcPr>
-            <w:tcW w:w="4648" w:type="dxa"/>
+            <w:tcW w:w="4560" w:type="dxa"/>
             <w:tcBorders>
               <w:left w:val="single" w:sz="2" w:space="0" w:color="808080"/>
               <w:bottom w:val="single" w:sz="2" w:space="0" w:color="808080"/>
@@ -529,7 +529,7 @@
         </w:tc>
         <w:tc>
           <w:tcPr>
-            <w:tcW w:w="3290" w:type="dxa"/>
+            <w:tcW w:w="3315" w:type="dxa"/>
             <w:tcBorders>
               <w:left w:val="single" w:sz="2" w:space="0" w:color="808080"/>
               <w:bottom w:val="single" w:sz="2" w:space="0" w:color="808080"/>
@@ -556,7 +556,7 @@
         <w:trPr/>
         <w:tc>
           <w:tcPr>
-            <w:tcW w:w="3400" w:type="dxa"/>
+            <w:tcW w:w="3463" w:type="dxa"/>
             <w:tcBorders>
               <w:left w:val="single" w:sz="6" w:space="0" w:color="808080"/>
               <w:bottom w:val="single" w:sz="2" w:space="0" w:color="808080"/>
@@ -580,7 +580,7 @@
         </w:tc>
         <w:tc>
           <w:tcPr>
-            <w:tcW w:w="4648" w:type="dxa"/>
+            <w:tcW w:w="4560" w:type="dxa"/>
             <w:tcBorders>
               <w:left w:val="single" w:sz="2" w:space="0" w:color="808080"/>
               <w:bottom w:val="single" w:sz="2" w:space="0" w:color="808080"/>
@@ -612,7 +612,7 @@
         </w:tc>
         <w:tc>
           <w:tcPr>
-            <w:tcW w:w="3290" w:type="dxa"/>
+            <w:tcW w:w="3315" w:type="dxa"/>
             <w:tcBorders>
               <w:left w:val="single" w:sz="2" w:space="0" w:color="808080"/>
               <w:bottom w:val="single" w:sz="2" w:space="0" w:color="808080"/>
@@ -639,7 +639,7 @@
         <w:trPr/>
         <w:tc>
           <w:tcPr>
-            <w:tcW w:w="3400" w:type="dxa"/>
+            <w:tcW w:w="3463" w:type="dxa"/>
             <w:tcBorders>
               <w:left w:val="single" w:sz="6" w:space="0" w:color="808080"/>
               <w:bottom w:val="single" w:sz="2" w:space="0" w:color="808080"/>
@@ -663,7 +663,7 @@
         </w:tc>
         <w:tc>
           <w:tcPr>
-            <w:tcW w:w="4648" w:type="dxa"/>
+            <w:tcW w:w="4560" w:type="dxa"/>
             <w:tcBorders>
               <w:left w:val="single" w:sz="2" w:space="0" w:color="808080"/>
               <w:bottom w:val="single" w:sz="2" w:space="0" w:color="808080"/>
@@ -687,7 +687,7 @@
         </w:tc>
         <w:tc>
           <w:tcPr>
-            <w:tcW w:w="3290" w:type="dxa"/>
+            <w:tcW w:w="3315" w:type="dxa"/>
             <w:tcBorders>
               <w:left w:val="single" w:sz="2" w:space="0" w:color="808080"/>
               <w:bottom w:val="single" w:sz="2" w:space="0" w:color="808080"/>
@@ -714,7 +714,7 @@
         <w:trPr/>
         <w:tc>
           <w:tcPr>
-            <w:tcW w:w="3400" w:type="dxa"/>
+            <w:tcW w:w="3463" w:type="dxa"/>
             <w:tcBorders>
               <w:left w:val="single" w:sz="6" w:space="0" w:color="808080"/>
               <w:bottom w:val="single" w:sz="6" w:space="0" w:color="808080"/>
@@ -738,7 +738,7 @@
         </w:tc>
         <w:tc>
           <w:tcPr>
-            <w:tcW w:w="4648" w:type="dxa"/>
+            <w:tcW w:w="4560" w:type="dxa"/>
             <w:tcBorders>
               <w:left w:val="single" w:sz="2" w:space="0" w:color="808080"/>
               <w:bottom w:val="single" w:sz="6" w:space="0" w:color="808080"/>
@@ -768,7 +768,7 @@
         </w:tc>
         <w:tc>
           <w:tcPr>
-            <w:tcW w:w="3290" w:type="dxa"/>
+            <w:tcW w:w="3315" w:type="dxa"/>
             <w:tcBorders>
               <w:left w:val="single" w:sz="2" w:space="0" w:color="808080"/>
               <w:bottom w:val="single" w:sz="6" w:space="0" w:color="808080"/>
@@ -856,7 +856,7 @@
       <w:spacing w:lineRule="auto" w:line="360"/>
     </w:pPr>
     <w:rPr>
-      <w:rFonts w:ascii="Noto Sans;Noto Sans CJK TC;Arial;sans-serif" w:hAnsi="Noto Sans;Noto Sans CJK TC;Arial;sans-serif" w:eastAsia="Noto Sans;Noto Sans CJK TC;Arial;sans-serif" w:cs="Noto Sans;Noto Sans CJK TC;Arial;sans-serif"/>
+      <w:rFonts w:ascii="Liberation Sans;Arial;Noto Sans CJK TC;sans-serif" w:hAnsi="Liberation Sans;Arial;Noto Sans CJK TC;sans-serif" w:eastAsia="Liberation Sans;Arial;Noto Sans CJK TC;sans-serif" w:cs="Liberation Sans;Arial;Noto Sans CJK TC;sans-serif"/>
       <w:color w:val="000000"/>
       <w:sz w:val="21"/>
       <w:szCs w:val="21"/>

</xml_diff>

<commit_message>
EN submission: column widths fixed in docx (4 pages)
Co-Authored-By: Claude Fable 5.1 <noreply@anthropic.com>
</commit_message>
<xml_diff>
--- a/hemonc_feature_submission_EN_20261021.docx
+++ b/hemonc_feature_submission_EN_20261021.docx
@@ -45,7 +45,7 @@
     </w:p>
     <w:tbl>
       <w:tblPr>
-        <w:tblW w:w="5000" w:type="pct"/>
+        <w:tblW w:w="9859" w:type="dxa"/>
         <w:jc w:val="left"/>
         <w:tblInd w:w="-7" w:type="dxa"/>
         <w:tblLayout w:type="fixed"/>
@@ -57,15 +57,15 @@
         </w:tblCellMar>
       </w:tblPr>
       <w:tblGrid>
-        <w:gridCol w:w="3463"/>
-        <w:gridCol w:w="4560"/>
-        <w:gridCol w:w="3315"/>
+        <w:gridCol w:w="1873"/>
+        <w:gridCol w:w="5916"/>
+        <w:gridCol w:w="2070"/>
       </w:tblGrid>
       <w:tr>
         <w:trPr/>
         <w:tc>
           <w:tcPr>
-            <w:tcW w:w="3463" w:type="dxa"/>
+            <w:tcW w:w="1873" w:type="dxa"/>
             <w:tcBorders>
               <w:top w:val="single" w:sz="6" w:space="0" w:color="808080"/>
               <w:left w:val="single" w:sz="6" w:space="0" w:color="808080"/>
@@ -92,7 +92,7 @@
         </w:tc>
         <w:tc>
           <w:tcPr>
-            <w:tcW w:w="4560" w:type="dxa"/>
+            <w:tcW w:w="5916" w:type="dxa"/>
             <w:tcBorders>
               <w:top w:val="single" w:sz="6" w:space="0" w:color="808080"/>
               <w:left w:val="single" w:sz="2" w:space="0" w:color="808080"/>
@@ -119,7 +119,7 @@
         </w:tc>
         <w:tc>
           <w:tcPr>
-            <w:tcW w:w="3315" w:type="dxa"/>
+            <w:tcW w:w="2070" w:type="dxa"/>
             <w:tcBorders>
               <w:top w:val="single" w:sz="6" w:space="0" w:color="808080"/>
               <w:left w:val="single" w:sz="2" w:space="0" w:color="808080"/>
@@ -149,7 +149,7 @@
         <w:trPr/>
         <w:tc>
           <w:tcPr>
-            <w:tcW w:w="3463" w:type="dxa"/>
+            <w:tcW w:w="1873" w:type="dxa"/>
             <w:tcBorders>
               <w:left w:val="single" w:sz="6" w:space="0" w:color="808080"/>
               <w:bottom w:val="single" w:sz="2" w:space="0" w:color="808080"/>
@@ -173,7 +173,7 @@
         </w:tc>
         <w:tc>
           <w:tcPr>
-            <w:tcW w:w="4560" w:type="dxa"/>
+            <w:tcW w:w="5916" w:type="dxa"/>
             <w:tcBorders>
               <w:left w:val="single" w:sz="2" w:space="0" w:color="808080"/>
               <w:bottom w:val="single" w:sz="2" w:space="0" w:color="808080"/>
@@ -197,7 +197,7 @@
         </w:tc>
         <w:tc>
           <w:tcPr>
-            <w:tcW w:w="3315" w:type="dxa"/>
+            <w:tcW w:w="2070" w:type="dxa"/>
             <w:tcBorders>
               <w:left w:val="single" w:sz="2" w:space="0" w:color="808080"/>
               <w:bottom w:val="single" w:sz="2" w:space="0" w:color="808080"/>
@@ -228,7 +228,7 @@
         <w:trPr/>
         <w:tc>
           <w:tcPr>
-            <w:tcW w:w="3463" w:type="dxa"/>
+            <w:tcW w:w="1873" w:type="dxa"/>
             <w:tcBorders>
               <w:left w:val="single" w:sz="6" w:space="0" w:color="808080"/>
               <w:bottom w:val="single" w:sz="2" w:space="0" w:color="808080"/>
@@ -252,7 +252,7 @@
         </w:tc>
         <w:tc>
           <w:tcPr>
-            <w:tcW w:w="4560" w:type="dxa"/>
+            <w:tcW w:w="5916" w:type="dxa"/>
             <w:tcBorders>
               <w:left w:val="single" w:sz="2" w:space="0" w:color="808080"/>
               <w:bottom w:val="single" w:sz="2" w:space="0" w:color="808080"/>
@@ -276,7 +276,7 @@
         </w:tc>
         <w:tc>
           <w:tcPr>
-            <w:tcW w:w="3315" w:type="dxa"/>
+            <w:tcW w:w="2070" w:type="dxa"/>
             <w:tcBorders>
               <w:left w:val="single" w:sz="2" w:space="0" w:color="808080"/>
               <w:bottom w:val="single" w:sz="2" w:space="0" w:color="808080"/>
@@ -308,7 +308,7 @@
         <w:trPr/>
         <w:tc>
           <w:tcPr>
-            <w:tcW w:w="3463" w:type="dxa"/>
+            <w:tcW w:w="1873" w:type="dxa"/>
             <w:tcBorders>
               <w:left w:val="single" w:sz="6" w:space="0" w:color="808080"/>
               <w:bottom w:val="single" w:sz="2" w:space="0" w:color="808080"/>
@@ -332,7 +332,7 @@
         </w:tc>
         <w:tc>
           <w:tcPr>
-            <w:tcW w:w="4560" w:type="dxa"/>
+            <w:tcW w:w="5916" w:type="dxa"/>
             <w:tcBorders>
               <w:left w:val="single" w:sz="2" w:space="0" w:color="808080"/>
               <w:bottom w:val="single" w:sz="2" w:space="0" w:color="808080"/>
@@ -356,7 +356,7 @@
         </w:tc>
         <w:tc>
           <w:tcPr>
-            <w:tcW w:w="3315" w:type="dxa"/>
+            <w:tcW w:w="2070" w:type="dxa"/>
             <w:tcBorders>
               <w:left w:val="single" w:sz="2" w:space="0" w:color="808080"/>
               <w:bottom w:val="single" w:sz="2" w:space="0" w:color="808080"/>
@@ -388,7 +388,7 @@
         <w:trPr/>
         <w:tc>
           <w:tcPr>
-            <w:tcW w:w="3463" w:type="dxa"/>
+            <w:tcW w:w="1873" w:type="dxa"/>
             <w:tcBorders>
               <w:left w:val="single" w:sz="6" w:space="0" w:color="808080"/>
               <w:bottom w:val="single" w:sz="2" w:space="0" w:color="808080"/>
@@ -412,7 +412,7 @@
         </w:tc>
         <w:tc>
           <w:tcPr>
-            <w:tcW w:w="4560" w:type="dxa"/>
+            <w:tcW w:w="5916" w:type="dxa"/>
             <w:tcBorders>
               <w:left w:val="single" w:sz="2" w:space="0" w:color="808080"/>
               <w:bottom w:val="single" w:sz="2" w:space="0" w:color="808080"/>
@@ -444,7 +444,7 @@
         </w:tc>
         <w:tc>
           <w:tcPr>
-            <w:tcW w:w="3315" w:type="dxa"/>
+            <w:tcW w:w="2070" w:type="dxa"/>
             <w:tcBorders>
               <w:left w:val="single" w:sz="2" w:space="0" w:color="808080"/>
               <w:bottom w:val="single" w:sz="2" w:space="0" w:color="808080"/>
@@ -471,7 +471,7 @@
         <w:trPr/>
         <w:tc>
           <w:tcPr>
-            <w:tcW w:w="3463" w:type="dxa"/>
+            <w:tcW w:w="1873" w:type="dxa"/>
             <w:tcBorders>
               <w:left w:val="single" w:sz="6" w:space="0" w:color="808080"/>
               <w:bottom w:val="single" w:sz="2" w:space="0" w:color="808080"/>
@@ -495,7 +495,7 @@
         </w:tc>
         <w:tc>
           <w:tcPr>
-            <w:tcW w:w="4560" w:type="dxa"/>
+            <w:tcW w:w="5916" w:type="dxa"/>
             <w:tcBorders>
               <w:left w:val="single" w:sz="2" w:space="0" w:color="808080"/>
               <w:bottom w:val="single" w:sz="2" w:space="0" w:color="808080"/>
@@ -529,7 +529,7 @@
         </w:tc>
         <w:tc>
           <w:tcPr>
-            <w:tcW w:w="3315" w:type="dxa"/>
+            <w:tcW w:w="2070" w:type="dxa"/>
             <w:tcBorders>
               <w:left w:val="single" w:sz="2" w:space="0" w:color="808080"/>
               <w:bottom w:val="single" w:sz="2" w:space="0" w:color="808080"/>
@@ -556,7 +556,7 @@
         <w:trPr/>
         <w:tc>
           <w:tcPr>
-            <w:tcW w:w="3463" w:type="dxa"/>
+            <w:tcW w:w="1873" w:type="dxa"/>
             <w:tcBorders>
               <w:left w:val="single" w:sz="6" w:space="0" w:color="808080"/>
               <w:bottom w:val="single" w:sz="2" w:space="0" w:color="808080"/>
@@ -580,7 +580,7 @@
         </w:tc>
         <w:tc>
           <w:tcPr>
-            <w:tcW w:w="4560" w:type="dxa"/>
+            <w:tcW w:w="5916" w:type="dxa"/>
             <w:tcBorders>
               <w:left w:val="single" w:sz="2" w:space="0" w:color="808080"/>
               <w:bottom w:val="single" w:sz="2" w:space="0" w:color="808080"/>
@@ -612,7 +612,7 @@
         </w:tc>
         <w:tc>
           <w:tcPr>
-            <w:tcW w:w="3315" w:type="dxa"/>
+            <w:tcW w:w="2070" w:type="dxa"/>
             <w:tcBorders>
               <w:left w:val="single" w:sz="2" w:space="0" w:color="808080"/>
               <w:bottom w:val="single" w:sz="2" w:space="0" w:color="808080"/>
@@ -639,7 +639,7 @@
         <w:trPr/>
         <w:tc>
           <w:tcPr>
-            <w:tcW w:w="3463" w:type="dxa"/>
+            <w:tcW w:w="1873" w:type="dxa"/>
             <w:tcBorders>
               <w:left w:val="single" w:sz="6" w:space="0" w:color="808080"/>
               <w:bottom w:val="single" w:sz="2" w:space="0" w:color="808080"/>
@@ -663,7 +663,7 @@
         </w:tc>
         <w:tc>
           <w:tcPr>
-            <w:tcW w:w="4560" w:type="dxa"/>
+            <w:tcW w:w="5916" w:type="dxa"/>
             <w:tcBorders>
               <w:left w:val="single" w:sz="2" w:space="0" w:color="808080"/>
               <w:bottom w:val="single" w:sz="2" w:space="0" w:color="808080"/>
@@ -687,7 +687,7 @@
         </w:tc>
         <w:tc>
           <w:tcPr>
-            <w:tcW w:w="3315" w:type="dxa"/>
+            <w:tcW w:w="2070" w:type="dxa"/>
             <w:tcBorders>
               <w:left w:val="single" w:sz="2" w:space="0" w:color="808080"/>
               <w:bottom w:val="single" w:sz="2" w:space="0" w:color="808080"/>
@@ -714,7 +714,7 @@
         <w:trPr/>
         <w:tc>
           <w:tcPr>
-            <w:tcW w:w="3463" w:type="dxa"/>
+            <w:tcW w:w="1873" w:type="dxa"/>
             <w:tcBorders>
               <w:left w:val="single" w:sz="6" w:space="0" w:color="808080"/>
               <w:bottom w:val="single" w:sz="6" w:space="0" w:color="808080"/>
@@ -738,7 +738,7 @@
         </w:tc>
         <w:tc>
           <w:tcPr>
-            <w:tcW w:w="4560" w:type="dxa"/>
+            <w:tcW w:w="5916" w:type="dxa"/>
             <w:tcBorders>
               <w:left w:val="single" w:sz="2" w:space="0" w:color="808080"/>
               <w:bottom w:val="single" w:sz="6" w:space="0" w:color="808080"/>
@@ -768,7 +768,7 @@
         </w:tc>
         <w:tc>
           <w:tcPr>
-            <w:tcW w:w="3315" w:type="dxa"/>
+            <w:tcW w:w="2070" w:type="dxa"/>
             <w:tcBorders>
               <w:left w:val="single" w:sz="2" w:space="0" w:color="808080"/>
               <w:bottom w:val="single" w:sz="6" w:space="0" w:color="808080"/>

</xml_diff>